<commit_message>
Add AP Scholar with Distinction
</commit_message>
<xml_diff>
--- a/DrewResume.docx
+++ b/DrewResume.docx
@@ -520,6 +520,27 @@
         <w:spacing w:after="0"/>
         <w:rPr>
           <w:rFonts w:ascii="Cambria" w:hAnsi="Cambria" w:cstheme="minorHAnsi"/>
+          <w:color w:val="0D0D0D" w:themeColor="text1" w:themeTint="F2"/>
+          <w:sz w:val="24"/>
+          <w:szCs w:val="24"/>
+        </w:rPr>
+      </w:pPr>
+      <w:r>
+        <w:rPr>
+          <w:rFonts w:ascii="Cambria" w:hAnsi="Cambria" w:cstheme="minorHAnsi"/>
+          <w:color w:val="0D0D0D" w:themeColor="text1" w:themeTint="F2"/>
+          <w:sz w:val="24"/>
+          <w:szCs w:val="24"/>
+        </w:rPr>
+        <w:t>Achievements: AP Scholar with Distinction</w:t>
+      </w:r>
+    </w:p>
+    <w:p>
+      <w:pPr>
+        <w:pStyle w:val="ListBullet"/>
+        <w:spacing w:after="0"/>
+        <w:rPr>
+          <w:rFonts w:ascii="Cambria" w:hAnsi="Cambria" w:cstheme="minorHAnsi"/>
           <w:i/>
           <w:iCs/>
           <w:color w:val="0D0D0D" w:themeColor="text1" w:themeTint="F2"/>
@@ -739,7 +760,25 @@
           <w:sz w:val="24"/>
           <w:szCs w:val="24"/>
         </w:rPr>
-        <w:t>in a group setting</w:t>
+        <w:t xml:space="preserve">in a </w:t>
+      </w:r>
+      <w:r>
+        <w:rPr>
+          <w:rFonts w:ascii="Cambria" w:hAnsi="Cambria" w:cstheme="minorHAnsi"/>
+          <w:color w:val="000000" w:themeColor="text1"/>
+          <w:sz w:val="24"/>
+          <w:szCs w:val="24"/>
+        </w:rPr>
+        <w:t xml:space="preserve">collaborative </w:t>
+      </w:r>
+      <w:r>
+        <w:rPr>
+          <w:rFonts w:ascii="Cambria" w:hAnsi="Cambria" w:cstheme="minorHAnsi"/>
+          <w:color w:val="000000" w:themeColor="text1"/>
+          <w:sz w:val="24"/>
+          <w:szCs w:val="24"/>
+        </w:rPr>
+        <w:t>group setting</w:t>
       </w:r>
     </w:p>
     <w:p>

</xml_diff>